<commit_message>
v829 add Moonlight particle gifts and occasion delivery
</commit_message>
<xml_diff>
--- a/docs/maintenance/AI开发项目_项目说明文档.docx
+++ b/docs/maintenance/AI开发项目_项目说明文档.docx
@@ -2960,6 +2960,67 @@
     <w:p>
       <w:r>
         <w:t>验证：首声与原微信消息音理论波形相关度大于 0.999，次声与 659.25Hz 同包络理论波形相关度大于 0.999；循环、静默间隔、离线缓存及完整 Node 回归 330/330 通过。</w:t>
+      </w:r>
+    </w:p>
+    <w:p>
+      <w:pPr>
+        <w:pStyle w:val="Heading1"/>
+      </w:pPr>
+      <w:r>
+        <w:t>本地预览 · 随机花束粒子礼物特效（2026-08-06，未发布）</w:t>
+      </w:r>
+    </w:p>
+    <w:p>
+      <w:r>
+        <w:t>产品目标：当角色送出的礼物名称包含花束、鲜花、玫瑰、百合、郁金香、向日葵、满天星等明确花礼词时，聊天礼物卡和信箱签收入口可打开全屏花束粒子特效。独立预览页封面已按用户反馈收束为仅显示“一束鲜花”的暗色发光线稿礼盒；盒体使用透视方盒、独立盒盖、顶部闭合蝴蝶结和双缎带尾分层绘制，避免线条穿模。其他非花礼物暂不启用本特效。</w:t>
+      </w:r>
+    </w:p>
+    <w:p>
+      <w:r>
+        <w:t>随机生成规则：花束不依赖固定图片。Canvas 2D 每次按种子重新选择花头、配色、枝叶、包装和花瓣轨迹，并通过固定锚点约束成一束完整花。当前花礼配方包含红玫瑰、蓝色满天星、香槟玫瑰、紫色桔梗和白色雏菊；每份配方同时固化花名、花语、配色、日期和随机种子，特效下方显示花名、花语、赠送角色与年月日。</w:t>
+      </w:r>
+    </w:p>
+    <w:p>
+      <w:r>
+        <w:t>稳定边界：新增 giftRecipe 只写入花礼消息、角色寄出的包裹和对应信箱记录，包裹到达后仍沿用原签收、通知与回复流程。已生成的花名、花语、日期和种子会随礼物保存，聊天历史与签收后的系统事实会把准确花种提供给角色，避免后续说成另一种花。渲染分辨率最高限制为 1.75 倍设备像素比；支持系统减少动态效果；页面隐藏、关闭、动画结束和重复播放都会清理动画帧与遮罩。</w:t>
+      </w:r>
+    </w:p>
+    <w:p>
+      <w:r>
+        <w:t>预览与验证：gift-flower-preview.html 仅用于本地效果确认，不含邀请码门槛。390×844 手机视口已检查发光线稿礼盒、精细蝴蝶结分层和拆礼物交互；花束说明区保持在底部安全区，花束主体由 0.73 屏高上移到 0.685 屏高，包装与花束下半部完整可见。玩偶入口改为真实外形随机，内置焦糖拥抱熊、奶油垂耳兔、可可守护犬和月光软绒猫四种独立骨架，分别绘制圆耳、长耳、垂耳或三角猫耳，并补充眼鼻口、肚皮、领结、脚掌、缝线与猫须等细节。订婚戒指内置圆钻、光环钻、心形钻和梨形钻四种宝石结构，使用更小的双层戒圈、细戒托和对应切面；连续播放会避开上一款，避免视觉上误以为没有随机。玩偶与戒指均显示随机款式名、角色赠言、赠送角色和年月日，当前仍只用于视觉方案确认，尚未接入正式角色送礼触发和持久化流程。专项测试覆盖四类玩偶、四类戒指、连续不重复、文字安全区、花束位置、花礼配方持久化和移动端清理。当前只存在于 codex/gift-bouquet-preview 本地预览分支，未提交、未推送、未升级正式版本。</w:t>
+      </w:r>
+    </w:p>
+    <w:p>
+      <w:pPr>
+        <w:pStyle w:val="Heading2"/>
+      </w:pPr>
+      <w:r>
+        <w:t>v829 · 月光礼盒与节日自主赠礼（2026-08-06）</w:t>
+      </w:r>
+    </w:p>
+    <w:p>
+      <w:r>
+        <w:t>正式礼物卡已在本地分支接入一束鲜花、玩偶礼物和订婚戒指三类粒子特效。花束在五套花材与配色中受控随机；玩偶在小熊、小兔、小狗、小猫中受控随机；戒指在圆钻、光环、心形、梨形中受控随机，并避免连续预览立即重复。戒圈主体使用圆形比例，礼物对象保持小巧、居中，说明文字固定在对象下方。</w:t>
+      </w:r>
+    </w:p>
+    <w:p>
+      <w:r>
+        <w:t>每张礼物卡会保存具体花名与花语、玩偶品种或戒指款式、中英文名、赠送日期、礼盒颜色和角色附言。角色后续读取历史或签收反馈时会看到同一份事实，不能把礼物说成另一种。送礼指令兼容 [送礼|礼物名|价格|角色附言]，旧三段格式继续可用。</w:t>
+      </w:r>
+    </w:p>
+    <w:p>
+      <w:r>
+        <w:t>角色发来的可展示礼物卡只保留简约线条礼盒和中英文礼物名，不显示礼物类型、颜色或预览控制。点击后礼盒先摇晃并发光 0.88 秒，再打开粒子特效。中文使用宋体类衬线字体，下方使用 Bodoni／Didot 风格英文名。</w:t>
+      </w:r>
+    </w:p>
+    <w:p>
+      <w:r>
+        <w:t>礼盒采用用户选定的“月光”正面线条结构，删除蝴蝶结下方会与盒盖穿插的两片飘带，只保留顶部两条轮廓和中央结点。礼盒有蓝、粉、白、红四种受控颜色，周围星光、标题光晕和线条同步跟随主色。预览页底部的礼物类型和四色按钮仅用于开发核对，正式角色礼物卡不显示这些按钮。</w:t>
+      </w:r>
+    </w:p>
+    <w:p>
+      <w:r>
+        <w:t>每天 09:00 后，登记的节日或纪念日只触发一次情侣礼物机会。系统只提供日期事实，角色结合人设、关系阶段、最近聊天和用户偏好，在花束、玩偶、订婚戒指中必须且只能自主选择一类。戒指仅在关系与承诺程度合适时可选；删除、拉黑和离线专注等既有拦截仍优先。正式发布版本为 v829，并使用新 Service Worker 缓存名避免旧端继续读取 v828 资源。</w:t>
       </w:r>
     </w:p>
     <w:sectPr>

</xml_diff>

<commit_message>
v830 refine full-screen gift reveal
</commit_message>
<xml_diff>
--- a/docs/maintenance/AI开发项目_项目说明文档.docx
+++ b/docs/maintenance/AI开发项目_项目说明文档.docx
@@ -3021,6 +3021,38 @@
     <w:p>
       <w:r>
         <w:t>每天 09:00 后，登记的节日或纪念日只触发一次情侣礼物机会。系统只提供日期事实，角色结合人设、关系阶段、最近聊天和用户偏好，在花束、玩偶、订婚戒指中必须且只能自主选择一类。戒指仅在关系与承诺程度合适时可选；删除、拉黑和离线专注等既有拦截仍优先。正式发布版本为 v829，并使用新 Service Worker 缓存名避免旧端继续读取 v828 资源。</w:t>
+      </w:r>
+    </w:p>
+    <w:p>
+      <w:pPr>
+        <w:pStyle w:val="Heading1"/>
+      </w:pPr>
+      <w:r>
+        <w:t>v830 · 三段式拆礼与自然送礼触发（2026-08-06）</w:t>
+      </w:r>
+    </w:p>
+    <w:p>
+      <w:pPr/>
+      <w:r>
+        <w:t>角色发来的粒子礼物卡恢复为接近原送礼模板的紧凑尺寸：聊天中只显示小型月光线稿礼盒、中文礼物名和英文副标题，不再用大幅礼物海报占据对话。正式流程固定为三次点击：第一次点击聊天礼物卡进入全屏礼盒；第二次点击全屏礼盒时只摇晃、发光并进入待开启状态；第三次再次点击礼盒才打开花束、玩偶或戒指粒子特效。正式卡片不显示开发预览按钮。</w:t>
+      </w:r>
+    </w:p>
+    <w:p>
+      <w:pPr/>
+      <w:r>
+        <w:t>花束粒子主体的基准位置由 0.685 屏高上移到 0.59 屏高，花头、枝叶、包装、蝴蝶结和下垂丝带作为同一组整体移动。包装渐变填充、边线与粒子对比度同步增强，390×844 手机视口中完整包装位于底部花名与花语说明之上，不再被文字遮住或只剩上半束花。</w:t>
+      </w:r>
+    </w:p>
+    <w:p>
+      <w:pPr/>
+      <w:r>
+        <w:t>送礼意图识别新增自然短句规则。用户不再需要准确说出“一束鲜花”；“想要花花”“送我花”“想收个礼物”“有没有小惊喜”“今天没有礼物吗”等都会进入本轮送礼决策。用户点名花或玩偶时优先按指定类别送出；只说礼物或惊喜时由角色结合人设与关系自主选择花、玩偶或合适阶段的订婚戒指。若模型只追问、口头答应或漏掉送礼标签，系统会执行一次纠正生成，并保留安全兜底，确保真实礼物卡落地。</w:t>
+      </w:r>
+    </w:p>
+    <w:p>
+      <w:pPr/>
+      <w:r>
+        <w:t>版本壳、入口页、资源查询和 Service Worker 缓存统一升级为 v830。专项验证覆盖紧凑礼物卡、全屏礼盒两段状态、三次点击后才打开粒子、花束与包装上移、四种礼盒颜色以及自然送礼触发和漏标纠正；完整回归结果以本次发布记录为准。</w:t>
       </w:r>
     </w:p>
     <w:sectPr>

</xml_diff>

<commit_message>
v831 center full-screen Moonlight gift box
</commit_message>
<xml_diff>
--- a/docs/maintenance/AI开发项目_项目说明文档.docx
+++ b/docs/maintenance/AI开发项目_项目说明文档.docx
@@ -3028,13 +3028,13 @@
         <w:pStyle w:val="Heading1"/>
       </w:pPr>
       <w:r>
-        <w:t>v830 · 三段式拆礼与自然送礼触发（2026-08-06）</w:t>
+        <w:t>v831 · 居中月光礼盒与自然送礼触发（2026-08-06）</w:t>
       </w:r>
     </w:p>
     <w:p>
       <w:pPr/>
       <w:r>
-        <w:t>角色发来的粒子礼物卡恢复为接近原送礼模板的紧凑尺寸：聊天中只显示小型月光线稿礼盒、中文礼物名和英文副标题，不再用大幅礼物海报占据对话。正式流程固定为三次点击：第一次点击聊天礼物卡进入全屏礼盒；第二次点击全屏礼盒时只摇晃、发光并进入待开启状态；第三次再次点击礼盒才打开花束、玩偶或戒指粒子特效。正式卡片不显示开发预览按钮。</w:t>
+        <w:t>角色发来的粒子礼物卡恢复为接近原送礼模板的紧凑尺寸：聊天中只显示小型月光线稿礼盒、中文礼物名和英文副标题，不再用大幅礼物海报占据对话。正式流程固定为三次点击：第一次点击聊天礼物卡进入无边框全屏场景，中央显示尺寸适中的月光礼盒；第二次点击全屏礼盒时只摇晃、发光并进入待开启状态；第三次再次点击礼盒才打开花束、玩偶或戒指粒子特效。正式卡片不显示开发预览按钮。</w:t>
       </w:r>
     </w:p>
     <w:p>
@@ -3052,7 +3052,7 @@
     <w:p>
       <w:pPr/>
       <w:r>
-        <w:t>版本壳、入口页、资源查询和 Service Worker 缓存统一升级为 v830。专项验证覆盖紧凑礼物卡、全屏礼盒两段状态、三次点击后才打开粒子、花束与包装上移、四种礼盒颜色以及自然送礼触发和漏标纠正；完整回归结果以本次发布记录为准。</w:t>
+        <w:t>版本壳、入口页、资源查询和 Service Worker 缓存统一升级为 v831。专项验证覆盖紧凑礼物卡、无边框全屏场景、居中中等尺寸礼盒、三次点击后才打开粒子、花束与包装上移、四种礼盒颜色以及自然送礼触发和漏标纠正；完整回归结果以本次发布记录为准。</w:t>
       </w:r>
     </w:p>
     <w:sectPr>

</xml_diff>

<commit_message>
v845 add hidden thought card easter egg
</commit_message>
<xml_diff>
--- a/docs/maintenance/AI开发项目_项目说明文档.docx
+++ b/docs/maintenance/AI开发项目_项目说明文档.docx
@@ -3573,6 +3573,44 @@
       </w:pPr>
       <w:r>
         <w:t>封面图片、文字、头像、按钮、分界线、评论点赞、删除和数据逻辑均未改动；浅色主题继续使用原有独立配色。</w:t>
+      </w:r>
+    </w:p>
+    <w:p>
+      <w:pPr>
+        <w:pStyle w:val="Heading1"/>
+      </w:pPr>
+      <w:r>
+        <w:t>v845 · 隐藏心声彩蛋与必触发问法（2026-08-07）</w:t>
+      </w:r>
+    </w:p>
+    <w:p>
+      <w:r>
+        <w:t>本版基于远端 v844 的朋友圈深色背景统一版本继续开发，保留 v844 的深色背景规则、v843 的微信与朋友圈无缝全屏显示，以及此前礼物系统、陪伴端能力和数据隔离规则。</w:t>
+      </w:r>
+    </w:p>
+    <w:p>
+      <w:r>
+        <w:t>新增隐藏心声彩蛋：角色可在发生特别重要的事情、连续思念或积累了许多想说的话时，自主发送神秘卡片。自主发送至少间隔三天，但不是固定计划任务，也不是每三天必发。</w:t>
+      </w:r>
+    </w:p>
+    <w:p>
+      <w:r>
+        <w:t>新增必定触发问法“在一起这么久，你有什么话想对我说吗？”及同义表达。命中明确问法时不走概率，并绕过自主彩蛋的三天间隔；普通的“想你”“爱你”“给我惊喜”不会误触发。若模型首次漏发卡片，会自动进行一次纠正生成。</w:t>
+      </w:r>
+    </w:p>
+    <w:p>
+      <w:r>
+        <w:t>播放流程为：聊天中的神秘卡片 → 全屏开场与横屏提示 → 开场停留六秒 → 用户开始 → 3、2、1 倒计时 → 一百条心声卡片以每条 0.4 秒的节奏自然堆叠。卡片落点限制在安全区域内，文字和卡框不会超出屏幕。</w:t>
+      </w:r>
+    </w:p>
+    <w:p>
+      <w:r>
+        <w:t>播放结束恢复为普通单张结束卡片，不使用粒子生成或消散。卡片内容、结束语和本次心声由角色结合设定与近期上下文自由生成，并通过历史与相似度检查降低重复。</w:t>
+      </w:r>
+    </w:p>
+    <w:p>
+      <w:r>
+        <w:t>页面壳、Service Worker、脚本缓存键和自动化断言统一升级为 v845。静态语法、隐藏心声专项测试、现有功能回归测试及浏览器完整播放流程均已核对。</w:t>
       </w:r>
     </w:p>
     <w:sectPr>

</xml_diff>

<commit_message>
v851 allow direct thought card requests
</commit_message>
<xml_diff>
--- a/docs/maintenance/AI开发项目_项目说明文档.docx
+++ b/docs/maintenance/AI开发项目_项目说明文档.docx
@@ -3805,6 +3805,39 @@
       </w:pPr>
       <w:r>
         <w:t>部署与验证：数据库迁移 202608080001 已应用；phone-role-push Edge Function 已发布为远端 version 10；app.js 语法检查和完整 Node 自动化回归 362/362 通过。前端构建统一升级为 v849。</w:t>
+      </w:r>
+    </w:p>
+    <w:p>
+      <w:pPr>
+        <w:pStyle w:val="Heading1"/>
+      </w:pPr>
+      <w:r>
+        <w:t>v851 · 口头索取心声彩蛋必触发（2026-08-08）</w:t>
+      </w:r>
+    </w:p>
+    <w:p>
+      <w:r>
+        <w:t>本版本基于远端 v849 的主动消息记忆上下文同步版本继续维护，完整保留最近聊天与长期记忆同步、每条用户消息重新计算主动联系等待时间，以及服务器发送前后的竞态保护。</w:t>
+      </w:r>
+    </w:p>
+    <w:p>
+      <w:r>
+        <w:t>隐藏心声彩蛋新增直接口头索取入口。用户说“给我发那个心情彩蛋”“心声彩蛋给我看一下”“我要他发那个隐藏卡片”等明确表达时，本轮必定触发，并绕过自主彩蛋的三天最短间隔；原有“在一起这么久，你有什么话想对我说吗？”及同义表达继续必定触发。</w:t>
+      </w:r>
+    </w:p>
+    <w:p>
+      <w:r>
+        <w:t>否定表达不会误触发，例如“别给我发心情彩蛋”“我不要你发心情彩蛋”“我不想看心声彩蛋”。普通“给我惊喜”仍不触发该彩蛋。自主发送逻辑不变：只有重要事件或连续思念积累到一定程度时由角色自行决定，三天只限制自主发送。</w:t>
+      </w:r>
+    </w:p>
+    <w:p>
+      <w:r>
+        <w:t>若角色模型第一次漏掉明确索取，系统会保持角色口吻与真实记忆重写一次，并强制输出一张新的心声卡片；卡片开场、短句和结束语继续经过历史相似度检查，避免复用旧内容。</w:t>
+      </w:r>
+    </w:p>
+    <w:p>
+      <w:r>
+        <w:t>页面壳、Service Worker、脚本缓存键和自动化断言统一升级为 v851。app.js 与 thought-card-effects.js 语法检查通过；心声彩蛋、好友同步、消息收发、扣点、许可证与主动消息专项测试通过；排除两个依赖外部运行环境的测试后，完整 Node 自动化回归 358/358 通过。</w:t>
       </w:r>
     </w:p>
     <w:sectPr>

</xml_diff>

<commit_message>
v875 brand companion app as North
</commit_message>
<xml_diff>
--- a/docs/maintenance/AI开发项目_项目说明文档.docx
+++ b/docs/maintenance/AI开发项目_项目说明文档.docx
@@ -4635,6 +4635,34 @@
     <w:p>
       <w:r>
         <w:t>新增回归验证了 schedule:false 不会再启动平行定时任务、原始回合被消费、结果查看被等待、无内容提示不会误报、总结不会执行两次。专项共同生活测试 22/22 通过。</w:t>
+      </w:r>
+    </w:p>
+    <w:p>
+      <w:pPr>
+        <w:pStyle w:val="Heading1"/>
+      </w:pPr>
+      <w:r>
+        <w:t>v875｜North 伴生 App 品牌与正式分发方向（2026-08-10）</w:t>
+      </w:r>
+    </w:p>
+    <w:p>
+      <w:r>
+        <w:t>现有 PhoneCompanionTest 继续作为独立的真实 iPhone 伴生 App，不把完整小手机网页装入原生 App。正式产品显示名确定为 North，使用用户提供的双猫与爱心气泡图片作为主 App 图标；Target 名、Bundle Identifier、App Groups、Family Controls、HealthKit、定位、推送 Entitlements 以及锁定、解锁、限额、同步和后台唤醒逻辑均保持不变。</w:t>
+      </w:r>
+    </w:p>
+    <w:p>
+      <w:r>
+        <w:t>图标资源保存为 1024×1024、无透明通道的 NorthAppIcon.appiconset，由 iOS 自动裁切桌面圆角。Xcode 只需在主 App Target 把 Display Name 设为 North，并把 App Icons Source 设为 NorthAppIcon；Monitor、Report、Shield 等扩展 Target 不改名、不替换权限。</w:t>
+      </w:r>
+    </w:p>
+    <w:p>
+      <w:r>
+        <w:t>分发路线确定为：先使用 TestFlight 外部测试验证安装、配对、授权、后台同步与真实锁定，不登记用户 UDID；TestFlight Build 每 90 天更新一次。产品稳定后可再申请非公开 App Store 分发。TestFlight 或非公开链接只负责安装，实际使用资格继续由小手机邀请码、配对和设备凭据控制。</w:t>
+      </w:r>
+    </w:p>
+    <w:p>
+      <w:r>
+        <w:t>v875 未修改 Supabase Edge Function、数据库迁移或两份 Swift 核心源码。新增品牌资源静态验证，确认图标尺寸、RGB 无透明通道、Asset Catalog 声明及 Bundle ID/Entitlements 保留说明；app.js 语法检查通过，伴生与缓存专项 40/40 通过，完整 Node 自动化回归 419/419 通过。</w:t>
       </w:r>
     </w:p>
     <w:sectPr>

</xml_diff>